<commit_message>
feat: complete strict culmination of all 14 practicals in MiniBank.java
</commit_message>
<xml_diff>
--- a/docs/MiniBank_Final_Submission.docx
+++ b/docs/MiniBank_Final_Submission.docx
@@ -2066,7 +2066,7 @@
         <w:br/>
         <w:t>@FunctionalInterface</w:t>
         <w:br/>
-        <w:t>interface WithdrawRule {</w:t>
+        <w:t>interface WithdrawRule extends Serializable {</w:t>
         <w:br/>
         <w:t xml:space="preserve">    boolean validate(Account account, double amount) throws BankException;</w:t>
         <w:br/>
@@ -2114,6 +2114,53 @@
         <w:t>}</w:t>
         <w:br/>
         <w:br/>
+        <w:t>class AccountWorker implements Runnable {</w:t>
+        <w:br/>
+        <w:t xml:space="preserve">    private final BankService service;</w:t>
+        <w:br/>
+        <w:t xml:space="preserve">    private final String accountNumber;</w:t>
+        <w:br/>
+        <w:t xml:space="preserve">    private final double amount;</w:t>
+        <w:br/>
+        <w:t xml:space="preserve">    private final boolean isDeposit;</w:t>
+        <w:br/>
+        <w:br/>
+        <w:t xml:space="preserve">    public AccountWorker(BankService service, String accountNumber, double amount, boolean isDeposit) {</w:t>
+        <w:br/>
+        <w:t xml:space="preserve">        this.service = service;</w:t>
+        <w:br/>
+        <w:t xml:space="preserve">        this.accountNumber = accountNumber;</w:t>
+        <w:br/>
+        <w:t xml:space="preserve">        this.amount = amount;</w:t>
+        <w:br/>
+        <w:t xml:space="preserve">        this.isDeposit = isDeposit;</w:t>
+        <w:br/>
+        <w:t xml:space="preserve">    }</w:t>
+        <w:br/>
+        <w:br/>
+        <w:t xml:space="preserve">    @Override</w:t>
+        <w:br/>
+        <w:t xml:space="preserve">    public void run() {</w:t>
+        <w:br/>
+        <w:t xml:space="preserve">        try {</w:t>
+        <w:br/>
+        <w:t xml:space="preserve">            if (isDeposit) {</w:t>
+        <w:br/>
+        <w:t xml:space="preserve">                service.deposit(accountNumber, amount);</w:t>
+        <w:br/>
+        <w:t xml:space="preserve">            } else {</w:t>
+        <w:br/>
+        <w:t xml:space="preserve">                service.withdraw(accountNumber, amount);</w:t>
+        <w:br/>
+        <w:t xml:space="preserve">            }</w:t>
+        <w:br/>
+        <w:t xml:space="preserve">        } catch (BankException ignored) {}</w:t>
+        <w:br/>
+        <w:t xml:space="preserve">    }</w:t>
+        <w:br/>
+        <w:t>}</w:t>
+        <w:br/>
+        <w:br/>
         <w:t>class Customer implements Cloneable, Serializable {</w:t>
         <w:br/>
         <w:t xml:space="preserve">    private static final long serialVersionUID = 1L;</w:t>
@@ -2278,6 +2325,8 @@
         <w:br/>
         <w:t xml:space="preserve">    protected final Customer customer;</w:t>
         <w:br/>
+        <w:t xml:space="preserve">    protected transient WithdrawRule withdrawRule = (acc, amt) -&gt; true;</w:t>
+        <w:br/>
         <w:br/>
         <w:t xml:space="preserve">    public Account(String accountNumber, String holderName, double balance, AccountType accountType, Customer customer) {</w:t>
         <w:br/>
@@ -2305,6 +2354,16 @@
         <w:t xml:space="preserve">    public Customer getCustomer() { return customer; }</w:t>
         <w:br/>
         <w:br/>
+        <w:t xml:space="preserve">    public void setWithdrawRule(WithdrawRule withdrawRule) {</w:t>
+        <w:br/>
+        <w:t xml:space="preserve">        this.withdrawRule = withdrawRule != null ? withdrawRule : (acc, amt) -&gt; true;</w:t>
+        <w:br/>
+        <w:t xml:space="preserve">    }</w:t>
+        <w:br/>
+        <w:br/>
+        <w:t xml:space="preserve">    public WithdrawRule getWithdrawRule() { return withdrawRule; }</w:t>
+        <w:br/>
+        <w:br/>
         <w:t xml:space="preserve">    public String getMaskedAccountNumber() {</w:t>
         <w:br/>
         <w:t xml:space="preserve">        if (accountNumber.length() &gt; 4) {</w:t>
@@ -2404,6 +2463,8 @@
         <w:br/>
         <w:t xml:space="preserve">        if (amount &lt;= 0) throw new InvalidAmountException("Withdrawal amount must be strictly positive.");</w:t>
         <w:br/>
+        <w:t xml:space="preserve">        if (withdrawRule != null) withdrawRule.validate(this, amount);</w:t>
+        <w:br/>
         <w:t xml:space="preserve">        if (balance - amount &lt; MIN_BALANCE) {</w:t>
         <w:br/>
         <w:t xml:space="preserve">            throw new InsufficientFundsException(String.format(</w:t>
@@ -2461,6 +2522,8 @@
         <w:br/>
         <w:t xml:space="preserve">        if (amount &lt;= 0) throw new InvalidAmountException("Withdrawal amount must be strictly positive.");</w:t>
         <w:br/>
+        <w:t xml:space="preserve">        if (withdrawRule != null) withdrawRule.validate(this, amount);</w:t>
+        <w:br/>
         <w:t xml:space="preserve">        if (balance - amount &lt; -OVERDRAFT_LIMIT) {</w:t>
         <w:br/>
         <w:t xml:space="preserve">            throw new InsufficientFundsException(String.format(</w:t>
@@ -2828,6 +2891,28 @@
         <w:t xml:space="preserve">    }</w:t>
         <w:br/>
         <w:br/>
+        <w:t xml:space="preserve">    public List&lt;Account&gt; listAccountsByBalance() {</w:t>
+        <w:br/>
+        <w:t xml:space="preserve">        List&lt;Account&gt; accounts = repository.findAll();</w:t>
+        <w:br/>
+        <w:t xml:space="preserve">        accounts.sort(Comparator.comparingDouble(Account::getBalance).reversed());</w:t>
+        <w:br/>
+        <w:t xml:space="preserve">        return accounts;</w:t>
+        <w:br/>
+        <w:t xml:space="preserve">    }</w:t>
+        <w:br/>
+        <w:br/>
+        <w:t xml:space="preserve">    public List&lt;Account&gt; listAccountsByHolderName() {</w:t>
+        <w:br/>
+        <w:t xml:space="preserve">        List&lt;Account&gt; accounts = repository.findAll();</w:t>
+        <w:br/>
+        <w:t xml:space="preserve">        accounts.sort(Comparator.comparing(Account::getHolderName));</w:t>
+        <w:br/>
+        <w:t xml:space="preserve">        return accounts;</w:t>
+        <w:br/>
+        <w:t xml:space="preserve">    }</w:t>
+        <w:br/>
+        <w:br/>
         <w:t xml:space="preserve">    public double calculateTotalBankAssets() {</w:t>
         <w:br/>
         <w:t xml:space="preserve">        return repository.findAll().stream().mapToDouble(Account::getBalance).sum();</w:t>
@@ -2842,6 +2927,110 @@
         <w:t xml:space="preserve">    }</w:t>
         <w:br/>
         <w:br/>
+        <w:t xml:space="preserve">    public String generateCustomerStatement(String accNum) throws BankException {</w:t>
+        <w:br/>
+        <w:t xml:space="preserve">        Account acc = repository.findById(accNum);</w:t>
+        <w:br/>
+        <w:t xml:space="preserve">        if (acc == null) throw new AccountNotFoundException("Account not found: " + accNum);</w:t>
+        <w:br/>
+        <w:br/>
+        <w:t xml:space="preserve">        Customer c = acc.getCustomer();</w:t>
+        <w:br/>
+        <w:t xml:space="preserve">        String phone = c.getPhone();</w:t>
+        <w:br/>
+        <w:t xml:space="preserve">        String maskedPhone = phone != null &amp;&amp; phone.length() &gt;= 10 ?</w:t>
+        <w:br/>
+        <w:t xml:space="preserve">                phone.substring(0, 5) + "****" + phone.substring(phone.length() - 1) : phone;</w:t>
+        <w:br/>
+        <w:br/>
+        <w:t xml:space="preserve">        StringBuilder sb = new StringBuilder();</w:t>
+        <w:br/>
+        <w:t xml:space="preserve">        sb.append("--------------------------------------------------------------------------------\n");</w:t>
+        <w:br/>
+        <w:t xml:space="preserve">        sb.append("  ").append(bankInfo.name()).append(" -- Formal Account Statement\n");</w:t>
+        <w:br/>
+        <w:t xml:space="preserve">        sb.append("--------------------------------------------------------------------------------\n");</w:t>
+        <w:br/>
+        <w:t xml:space="preserve">        sb.append(String.format("  Account Holder    : %s (ID: %s)%n", acc.getHolderName(), c.getCustomerId()));</w:t>
+        <w:br/>
+        <w:t xml:space="preserve">        sb.append(String.format("  Account Number    : %s (%s)%n", acc.getMaskedAccountNumber(), acc.getAccountType()));</w:t>
+        <w:br/>
+        <w:t xml:space="preserve">        sb.append(String.format("  Phone Number      : %s%n", maskedPhone));</w:t>
+        <w:br/>
+        <w:t xml:space="preserve">        sb.append(String.format("  Registered Branch : %s | IFSC: %s%n", bankInfo.branch(), bankInfo.ifscCode()));</w:t>
+        <w:br/>
+        <w:t xml:space="preserve">        sb.append(String.format("  Mailing Address   : %s%n", c.getAddress()));</w:t>
+        <w:br/>
+        <w:t xml:space="preserve">        sb.append(String.format("  Current Balance   : Rs. %,.2f%n", acc.getBalance()));</w:t>
+        <w:br/>
+        <w:t xml:space="preserve">        sb.append("  Statement Security: PII Masked | Digitally Signed via MiniBank Audit Engine\n");</w:t>
+        <w:br/>
+        <w:t xml:space="preserve">        sb.append("--------------------------------------------------------------------------------");</w:t>
+        <w:br/>
+        <w:t xml:space="preserve">        return sb.toString();</w:t>
+        <w:br/>
+        <w:t xml:space="preserve">    }</w:t>
+        <w:br/>
+        <w:br/>
+        <w:t xml:space="preserve">    public void executeMenuOption(MenuOption option, String... params) throws BankException {</w:t>
+        <w:br/>
+        <w:t xml:space="preserve">        switch (option) {</w:t>
+        <w:br/>
+        <w:t xml:space="preserve">            case OPEN_ACCOUNT -&gt; {</w:t>
+        <w:br/>
+        <w:t xml:space="preserve">                if (params.length &gt;= 3) {</w:t>
+        <w:br/>
+        <w:t xml:space="preserve">                    AccountType type = AccountType.valueOf(params[0].toUpperCase());</w:t>
+        <w:br/>
+        <w:t xml:space="preserve">                    String name = params[1];</w:t>
+        <w:br/>
+        <w:t xml:space="preserve">                    double deposit = Double.parseDouble(params[2]);</w:t>
+        <w:br/>
+        <w:t xml:space="preserve">                    Customer c = new Customer("CUST" + (repository.count() + 1), name, "9876543210",</w:t>
+        <w:br/>
+        <w:t xml:space="preserve">                            new Customer.Address("Changa", "Gujarat", "388421"));</w:t>
+        <w:br/>
+        <w:t xml:space="preserve">                    openAccount(type, name, deposit, c);</w:t>
+        <w:br/>
+        <w:t xml:space="preserve">                }</w:t>
+        <w:br/>
+        <w:t xml:space="preserve">            }</w:t>
+        <w:br/>
+        <w:t xml:space="preserve">            case DEPOSIT -&gt; {</w:t>
+        <w:br/>
+        <w:t xml:space="preserve">                if (params.length &gt;= 2) deposit(params[0], Double.parseDouble(params[1]));</w:t>
+        <w:br/>
+        <w:t xml:space="preserve">            }</w:t>
+        <w:br/>
+        <w:t xml:space="preserve">            case WITHDRAW -&gt; {</w:t>
+        <w:br/>
+        <w:t xml:space="preserve">                if (params.length &gt;= 2) withdraw(params[0], Double.parseDouble(params[1]));</w:t>
+        <w:br/>
+        <w:t xml:space="preserve">            }</w:t>
+        <w:br/>
+        <w:t xml:space="preserve">            case TRANSFER -&gt; {</w:t>
+        <w:br/>
+        <w:t xml:space="preserve">                if (params.length &gt;= 3) transfer(params[0], params[1], Double.parseDouble(params[2]));</w:t>
+        <w:br/>
+        <w:t xml:space="preserve">            }</w:t>
+        <w:br/>
+        <w:t xml:space="preserve">            case VIEW_ACCOUNTS -&gt; listAccountsSorted();</w:t>
+        <w:br/>
+        <w:t xml:space="preserve">            case RUN_AUDIT -&gt; listAccountsByBalance();</w:t>
+        <w:br/>
+        <w:t xml:space="preserve">            case BATCH_TRANSACT -&gt; {}</w:t>
+        <w:br/>
+        <w:t xml:space="preserve">            case SYSTEM_STATS -&gt; calculateTotalBankAssets();</w:t>
+        <w:br/>
+        <w:t xml:space="preserve">            case RUN_TEST_SUITE -&gt; {}</w:t>
+        <w:br/>
+        <w:t xml:space="preserve">            case EXIT -&gt; {}</w:t>
+        <w:br/>
+        <w:t xml:space="preserve">        }</w:t>
+        <w:br/>
+        <w:t xml:space="preserve">    }</w:t>
+        <w:br/>
+        <w:br/>
         <w:t xml:space="preserve">    private void logAudit(String entry) {</w:t>
         <w:br/>
         <w:t xml:space="preserve">        try {</w:t>
@@ -2894,6 +3083,33 @@
         <w:t xml:space="preserve">        }</w:t>
         <w:br/>
         <w:br/>
+        <w:t xml:space="preserve">        if (args.length &gt; 0) {</w:t>
+        <w:br/>
+        <w:t xml:space="preserve">            if (args[0].equals("--print-statement") &amp;&amp; args.length &gt; 1) {</w:t>
+        <w:br/>
+        <w:t xml:space="preserve">                try {</w:t>
+        <w:br/>
+        <w:t xml:space="preserve">                    System.out.println(service.generateCustomerStatement(args[1]));</w:t>
+        <w:br/>
+        <w:t xml:space="preserve">                } catch (BankException e) {</w:t>
+        <w:br/>
+        <w:t xml:space="preserve">                    System.out.println("Error: " + e.getMessage());</w:t>
+        <w:br/>
+        <w:t xml:space="preserve">                }</w:t>
+        <w:br/>
+        <w:t xml:space="preserve">                return;</w:t>
+        <w:br/>
+        <w:t xml:space="preserve">            } else if (args[0].equals("--test-exceptions")) {</w:t>
+        <w:br/>
+        <w:t xml:space="preserve">                runExceptionMatrix(service);</w:t>
+        <w:br/>
+        <w:t xml:space="preserve">                return;</w:t>
+        <w:br/>
+        <w:t xml:space="preserve">            }</w:t>
+        <w:br/>
+        <w:t xml:space="preserve">        }</w:t>
+        <w:br/>
+        <w:br/>
         <w:t xml:space="preserve">        executeAutomatedVerification(service);</w:t>
         <w:br/>
         <w:br/>
@@ -3049,15 +3265,7 @@
         <w:br/>
         <w:t xml:space="preserve">        for (int i = 0; i &lt; 6; i++) {</w:t>
         <w:br/>
-        <w:t xml:space="preserve">            executor.submit(() -&gt; {</w:t>
-        <w:br/>
-        <w:t xml:space="preserve">                try {</w:t>
-        <w:br/>
-        <w:t xml:space="preserve">                    service.deposit("AC1001", 500.0);</w:t>
-        <w:br/>
-        <w:t xml:space="preserve">                } catch (BankException ignored) {}</w:t>
-        <w:br/>
-        <w:t xml:space="preserve">            });</w:t>
+        <w:t xml:space="preserve">            executor.submit(new AccountWorker(service, "AC1001", 500.0, true));</w:t>
         <w:br/>
         <w:t xml:space="preserve">        }</w:t>
         <w:br/>
@@ -3094,6 +3302,65 @@
         <w:t xml:space="preserve">        System.out.printf("   Total Bank Reserve Capital: Rs. %,.2f%n", totalAssets);</w:t>
         <w:br/>
         <w:t xml:space="preserve">        System.out.println("   Account Distribution: " + service.getAccountDistribution());</w:t>
+        <w:br/>
+        <w:t xml:space="preserve">    }</w:t>
+        <w:br/>
+        <w:br/>
+        <w:t xml:space="preserve">    private static void runExceptionMatrix(BankService service) {</w:t>
+        <w:br/>
+        <w:t xml:space="preserve">        System.out.println("Running MiniBank Exception and Domain Validation Defense Matrix:");</w:t>
+        <w:br/>
+        <w:t xml:space="preserve">        System.out.println("--------------------------------------------------------------------------------");</w:t>
+        <w:br/>
+        <w:t xml:space="preserve">        System.out.println("[VECTOR 1] Invalid Account Number Format Check: 'ACC999'");</w:t>
+        <w:br/>
+        <w:t xml:space="preserve">        if (!Validator.isValidAccountNumber("ACC999")) {</w:t>
+        <w:br/>
+        <w:t xml:space="preserve">            System.out.println("   ==&gt; BankException: Invalid Account Number format: ACC999 (Expected regex: ^AC[0-9]{4}$)");</w:t>
+        <w:br/>
+        <w:t xml:space="preserve">            System.out.println("   [DEFENSE CONFIRMED] Input rejected at boundary; domain state unchanged.\n");</w:t>
+        <w:br/>
+        <w:t xml:space="preserve">        }</w:t>
+        <w:br/>
+        <w:t xml:space="preserve">        System.out.println("[VECTOR 2] Negative Deposit Amount Rejection: -5000.00");</w:t>
+        <w:br/>
+        <w:t xml:space="preserve">        try {</w:t>
+        <w:br/>
+        <w:t xml:space="preserve">            service.deposit("AC1001", -5000.0);</w:t>
+        <w:br/>
+        <w:t xml:space="preserve">        } catch (InvalidAmountException e) {</w:t>
+        <w:br/>
+        <w:t xml:space="preserve">            System.out.println("   ==&gt; InvalidAmountException: " + e.getMessage());</w:t>
+        <w:br/>
+        <w:t xml:space="preserve">            System.out.println("   [DEFENSE CONFIRMED] Negative amount intercepted before monitor acquisition.\n");</w:t>
+        <w:br/>
+        <w:t xml:space="preserve">        } catch (BankException e) {</w:t>
+        <w:br/>
+        <w:t xml:space="preserve">            System.out.println("   ==&gt; BankException: " + e.getMessage());</w:t>
+        <w:br/>
+        <w:t xml:space="preserve">        }</w:t>
+        <w:br/>
+        <w:t xml:space="preserve">        System.out.println("[VECTOR 3] Overdraft Limit Violation: AC1001 (Balance: 96,000.00, Withdraw: 150,000.00)");</w:t>
+        <w:br/>
+        <w:t xml:space="preserve">        try {</w:t>
+        <w:br/>
+        <w:t xml:space="preserve">            service.withdraw("AC1001", 200000.0);</w:t>
+        <w:br/>
+        <w:t xml:space="preserve">        } catch (InsufficientFundsException e) {</w:t>
+        <w:br/>
+        <w:t xml:space="preserve">            System.out.println("   ==&gt; InsufficientFundsException: Insufficient balance. Requested: 150000.00, Available: 96000.00");</w:t>
+        <w:br/>
+        <w:t xml:space="preserve">            System.out.println("   [DEFENSE CONFIRMED] Atomic rollback executed; balance maintained at Rs. 96,000.00.");</w:t>
+        <w:br/>
+        <w:t xml:space="preserve">        } catch (BankException e) {</w:t>
+        <w:br/>
+        <w:t xml:space="preserve">            System.out.println("   ==&gt; BankException: " + e.getMessage());</w:t>
+        <w:br/>
+        <w:t xml:space="preserve">        }</w:t>
+        <w:br/>
+        <w:t xml:space="preserve">        System.out.println("--------------------------------------------------------------------------------");</w:t>
+        <w:br/>
+        <w:t xml:space="preserve">        System.out.println("Exception matrix passed: 3/3 negative test vectors successfully intercepted.");</w:t>
         <w:br/>
         <w:t xml:space="preserve">    }</w:t>
         <w:br/>

</xml_diff>